<commit_message>
Lehrerhinweise W0–W6: Boss-Tabellen mit Fallen-Spalte, Abgleich mit den Seeds
Neue Spalte „Fallen“ (P-Nummern aus dem Seed) in allen sieben Boss-Tabellen, Test gegen den Seed (ids, Stufe,
Niveau, Fallen); Generator-Anhänge an die aktuellen Wortlisten angeglichen; W6-B-15 in der Boss-Tabelle auf
BA/CAD → DAECBD korrigiert (E138). Neu gebaut, 0 Kontrast-Verstöße, npm test grün.

Co-Authored-By: Claude Opus 5.5 <noreply@anthropic.com>
Claude-Session: https://claude.ai/code/session_01JKXVQqFeKVmyQ9jfHw4db3
</commit_message>
<xml_diff>
--- a/materialien/00_Lehrerhinweise/KR_W0_Lehrerhinweise.docx
+++ b/materialien/00_Lehrerhinweise/KR_W0_Lehrerhinweise.docx
@@ -9364,8 +9364,9 @@
         <w:gridCol w:w="963"/>
         <w:gridCol w:w="850"/>
         <w:gridCol w:w="1360"/>
-        <w:gridCol w:w="4139"/>
+        <w:gridCol w:w="3402"/>
         <w:gridCol w:w="1984"/>
+        <w:gridCol w:w="737"/>
       </w:tblGrid>
       <w:tr>
         <w:trPr>
@@ -9455,7 +9456,7 @@
         </w:tc>
         <w:tc>
           <w:tcPr>
-            <w:tcW w:type="dxa" w:w="4139"/>
+            <w:tcW w:type="dxa" w:w="3402"/>
             <w:shd w:val="clear" w:color="auto" w:fill="F2EADB"/>
             <w:tcMar>
               <w:top w:w="40" w:type="dxa"/>
@@ -9504,6 +9505,33 @@
                 <w:sz w:val="16"/>
               </w:rPr>
               <w:t>Lösung</w:t>
+            </w:r>
+          </w:p>
+        </w:tc>
+        <w:tc>
+          <w:tcPr>
+            <w:tcW w:type="dxa" w:w="737"/>
+            <w:shd w:val="clear" w:color="auto" w:fill="F2EADB"/>
+            <w:tcMar>
+              <w:top w:w="40" w:type="dxa"/>
+              <w:start w:w="70" w:type="dxa"/>
+              <w:bottom w:w="40" w:type="dxa"/>
+              <w:end w:w="70" w:type="dxa"/>
+            </w:tcMar>
+          </w:tcPr>
+          <w:p>
+            <w:pPr>
+              <w:spacing w:before="0" w:after="0"/>
+            </w:pPr>
+            <w:r>
+              <w:rPr>
+                <w:rFonts w:ascii="Calibri" w:hAnsi="Calibri" w:cs="Calibri" w:eastAsia="Calibri"/>
+                <w:b/>
+                <w:i w:val="0"/>
+                <w:color w:val="1B1B1F"/>
+                <w:sz w:val="16"/>
+              </w:rPr>
+              <w:t>Fallen</w:t>
             </w:r>
           </w:p>
         </w:tc>
@@ -9591,7 +9619,7 @@
         </w:tc>
         <w:tc>
           <w:tcPr>
-            <w:tcW w:type="dxa" w:w="4139"/>
+            <w:tcW w:type="dxa" w:w="3402"/>
             <w:tcMar>
               <w:top w:w="30" w:type="dxa"/>
               <w:start w:w="70" w:type="dxa"/>
@@ -9638,6 +9666,32 @@
                 <w:sz w:val="16"/>
               </w:rPr>
               <w:t>(B)</w:t>
+            </w:r>
+          </w:p>
+        </w:tc>
+        <w:tc>
+          <w:tcPr>
+            <w:tcW w:type="dxa" w:w="737"/>
+            <w:tcMar>
+              <w:top w:w="30" w:type="dxa"/>
+              <w:start w:w="70" w:type="dxa"/>
+              <w:bottom w:w="30" w:type="dxa"/>
+              <w:end w:w="70" w:type="dxa"/>
+            </w:tcMar>
+          </w:tcPr>
+          <w:p>
+            <w:pPr>
+              <w:spacing w:before="0" w:after="0"/>
+            </w:pPr>
+            <w:r>
+              <w:rPr>
+                <w:rFonts w:ascii="Calibri" w:hAnsi="Calibri" w:cs="Calibri" w:eastAsia="Calibri"/>
+                <w:b w:val="0"/>
+                <w:i w:val="0"/>
+                <w:color w:val="1B1B1F"/>
+                <w:sz w:val="16"/>
+              </w:rPr>
+              <w:t>P5</w:t>
             </w:r>
           </w:p>
         </w:tc>
@@ -9725,7 +9779,7 @@
         </w:tc>
         <w:tc>
           <w:tcPr>
-            <w:tcW w:type="dxa" w:w="4139"/>
+            <w:tcW w:type="dxa" w:w="3402"/>
             <w:tcMar>
               <w:top w:w="30" w:type="dxa"/>
               <w:start w:w="70" w:type="dxa"/>
@@ -9782,6 +9836,32 @@
                 <w:sz w:val="16"/>
               </w:rPr>
               <w:t>(C) – nur (C) hat einen geheimen Schlüssel (P5)</w:t>
+            </w:r>
+          </w:p>
+        </w:tc>
+        <w:tc>
+          <w:tcPr>
+            <w:tcW w:type="dxa" w:w="737"/>
+            <w:tcMar>
+              <w:top w:w="30" w:type="dxa"/>
+              <w:start w:w="70" w:type="dxa"/>
+              <w:bottom w:w="30" w:type="dxa"/>
+              <w:end w:w="70" w:type="dxa"/>
+            </w:tcMar>
+          </w:tcPr>
+          <w:p>
+            <w:pPr>
+              <w:spacing w:before="0" w:after="0"/>
+            </w:pPr>
+            <w:r>
+              <w:rPr>
+                <w:rFonts w:ascii="Calibri" w:hAnsi="Calibri" w:cs="Calibri" w:eastAsia="Calibri"/>
+                <w:b w:val="0"/>
+                <w:i w:val="0"/>
+                <w:color w:val="1B1B1F"/>
+                <w:sz w:val="16"/>
+              </w:rPr>
+              <w:t>P5</w:t>
             </w:r>
           </w:p>
         </w:tc>
@@ -9869,7 +9949,7 @@
         </w:tc>
         <w:tc>
           <w:tcPr>
-            <w:tcW w:type="dxa" w:w="4139"/>
+            <w:tcW w:type="dxa" w:w="3402"/>
             <w:tcMar>
               <w:top w:w="30" w:type="dxa"/>
               <w:start w:w="70" w:type="dxa"/>
@@ -9946,6 +10026,32 @@
                 <w:sz w:val="16"/>
               </w:rPr>
               <w:t xml:space="preserve"> (t (20) + 6 = 26 → Z, P2)</w:t>
+            </w:r>
+          </w:p>
+        </w:tc>
+        <w:tc>
+          <w:tcPr>
+            <w:tcW w:type="dxa" w:w="737"/>
+            <w:tcMar>
+              <w:top w:w="30" w:type="dxa"/>
+              <w:start w:w="70" w:type="dxa"/>
+              <w:bottom w:w="30" w:type="dxa"/>
+              <w:end w:w="70" w:type="dxa"/>
+            </w:tcMar>
+          </w:tcPr>
+          <w:p>
+            <w:pPr>
+              <w:spacing w:before="0" w:after="0"/>
+            </w:pPr>
+            <w:r>
+              <w:rPr>
+                <w:rFonts w:ascii="Calibri" w:hAnsi="Calibri" w:cs="Calibri" w:eastAsia="Calibri"/>
+                <w:b w:val="0"/>
+                <w:i w:val="0"/>
+                <w:color w:val="1B1B1F"/>
+                <w:sz w:val="16"/>
+              </w:rPr>
+              <w:t>P2</w:t>
             </w:r>
           </w:p>
         </w:tc>
@@ -10033,7 +10139,7 @@
         </w:tc>
         <w:tc>
           <w:tcPr>
-            <w:tcW w:type="dxa" w:w="4139"/>
+            <w:tcW w:type="dxa" w:w="3402"/>
             <w:tcMar>
               <w:top w:w="30" w:type="dxa"/>
               <w:start w:w="70" w:type="dxa"/>
@@ -10130,6 +10236,32 @@
                 <w:sz w:val="16"/>
               </w:rPr>
               <w:t xml:space="preserve"> (12 : 3 = 4 Spalten, P3)</w:t>
+            </w:r>
+          </w:p>
+        </w:tc>
+        <w:tc>
+          <w:tcPr>
+            <w:tcW w:type="dxa" w:w="737"/>
+            <w:tcMar>
+              <w:top w:w="30" w:type="dxa"/>
+              <w:start w:w="70" w:type="dxa"/>
+              <w:bottom w:w="30" w:type="dxa"/>
+              <w:end w:w="70" w:type="dxa"/>
+            </w:tcMar>
+          </w:tcPr>
+          <w:p>
+            <w:pPr>
+              <w:spacing w:before="0" w:after="0"/>
+            </w:pPr>
+            <w:r>
+              <w:rPr>
+                <w:rFonts w:ascii="Calibri" w:hAnsi="Calibri" w:cs="Calibri" w:eastAsia="Calibri"/>
+                <w:b w:val="0"/>
+                <w:i w:val="0"/>
+                <w:color w:val="1B1B1F"/>
+                <w:sz w:val="16"/>
+              </w:rPr>
+              <w:t>P3</w:t>
             </w:r>
           </w:p>
         </w:tc>
@@ -10217,7 +10349,7 @@
         </w:tc>
         <w:tc>
           <w:tcPr>
-            <w:tcW w:type="dxa" w:w="4139"/>
+            <w:tcW w:type="dxa" w:w="3402"/>
             <w:tcMar>
               <w:top w:w="30" w:type="dxa"/>
               <w:start w:w="70" w:type="dxa"/>
@@ -10274,6 +10406,32 @@
                 <w:sz w:val="16"/>
               </w:rPr>
               <w:t>Transposition: Skytale, Gartenzaun, Fleißner · Substitution: Caesar, Atbash, Polybios</w:t>
+            </w:r>
+          </w:p>
+        </w:tc>
+        <w:tc>
+          <w:tcPr>
+            <w:tcW w:type="dxa" w:w="737"/>
+            <w:tcMar>
+              <w:top w:w="30" w:type="dxa"/>
+              <w:start w:w="70" w:type="dxa"/>
+              <w:bottom w:w="30" w:type="dxa"/>
+              <w:end w:w="70" w:type="dxa"/>
+            </w:tcMar>
+          </w:tcPr>
+          <w:p>
+            <w:pPr>
+              <w:spacing w:before="0" w:after="0"/>
+            </w:pPr>
+            <w:r>
+              <w:rPr>
+                <w:rFonts w:ascii="Calibri" w:hAnsi="Calibri" w:cs="Calibri" w:eastAsia="Calibri"/>
+                <w:b w:val="0"/>
+                <w:i w:val="0"/>
+                <w:color w:val="1B1B1F"/>
+                <w:sz w:val="16"/>
+              </w:rPr>
+              <w:t>P5</w:t>
             </w:r>
           </w:p>
         </w:tc>
@@ -10361,7 +10519,7 @@
         </w:tc>
         <w:tc>
           <w:tcPr>
-            <w:tcW w:type="dxa" w:w="4139"/>
+            <w:tcW w:type="dxa" w:w="3402"/>
             <w:tcMar>
               <w:top w:w="30" w:type="dxa"/>
               <w:start w:w="70" w:type="dxa"/>
@@ -10448,6 +10606,32 @@
                 <w:sz w:val="16"/>
               </w:rPr>
               <w:t>verratimsenat</w:t>
+            </w:r>
+          </w:p>
+        </w:tc>
+        <w:tc>
+          <w:tcPr>
+            <w:tcW w:type="dxa" w:w="737"/>
+            <w:tcMar>
+              <w:top w:w="30" w:type="dxa"/>
+              <w:start w:w="70" w:type="dxa"/>
+              <w:bottom w:w="30" w:type="dxa"/>
+              <w:end w:w="70" w:type="dxa"/>
+            </w:tcMar>
+          </w:tcPr>
+          <w:p>
+            <w:pPr>
+              <w:spacing w:before="0" w:after="0"/>
+            </w:pPr>
+            <w:r>
+              <w:rPr>
+                <w:rFonts w:ascii="Calibri" w:hAnsi="Calibri" w:cs="Calibri" w:eastAsia="Calibri"/>
+                <w:b w:val="0"/>
+                <w:i w:val="0"/>
+                <w:color w:val="1B1B1F"/>
+                <w:sz w:val="16"/>
+              </w:rPr>
+              <w:t>P3</w:t>
             </w:r>
           </w:p>
         </w:tc>
@@ -10535,7 +10719,7 @@
         </w:tc>
         <w:tc>
           <w:tcPr>
-            <w:tcW w:type="dxa" w:w="4139"/>
+            <w:tcW w:type="dxa" w:w="3402"/>
             <w:tcMar>
               <w:top w:w="30" w:type="dxa"/>
               <w:start w:w="70" w:type="dxa"/>
@@ -10602,6 +10786,32 @@
                 <w:sz w:val="16"/>
               </w:rPr>
               <w:t>(a) 26, Z (b) 26, Z (c) 7, G</w:t>
+            </w:r>
+          </w:p>
+        </w:tc>
+        <w:tc>
+          <w:tcPr>
+            <w:tcW w:type="dxa" w:w="737"/>
+            <w:tcMar>
+              <w:top w:w="30" w:type="dxa"/>
+              <w:start w:w="70" w:type="dxa"/>
+              <w:bottom w:w="30" w:type="dxa"/>
+              <w:end w:w="70" w:type="dxa"/>
+            </w:tcMar>
+          </w:tcPr>
+          <w:p>
+            <w:pPr>
+              <w:spacing w:before="0" w:after="0"/>
+            </w:pPr>
+            <w:r>
+              <w:rPr>
+                <w:rFonts w:ascii="Calibri" w:hAnsi="Calibri" w:cs="Calibri" w:eastAsia="Calibri"/>
+                <w:b w:val="0"/>
+                <w:i w:val="0"/>
+                <w:color w:val="1B1B1F"/>
+                <w:sz w:val="16"/>
+              </w:rPr>
+              <w:t>P2</w:t>
             </w:r>
           </w:p>
         </w:tc>
@@ -10689,7 +10899,7 @@
         </w:tc>
         <w:tc>
           <w:tcPr>
-            <w:tcW w:type="dxa" w:w="4139"/>
+            <w:tcW w:type="dxa" w:w="3402"/>
             <w:tcMar>
               <w:top w:w="30" w:type="dxa"/>
               <w:start w:w="70" w:type="dxa"/>
@@ -10776,6 +10986,32 @@
                 <w:sz w:val="16"/>
               </w:rPr>
               <w:t>k = 9; Entschlüsseln mit 17</w:t>
+            </w:r>
+          </w:p>
+        </w:tc>
+        <w:tc>
+          <w:tcPr>
+            <w:tcW w:type="dxa" w:w="737"/>
+            <w:tcMar>
+              <w:top w:w="30" w:type="dxa"/>
+              <w:start w:w="70" w:type="dxa"/>
+              <w:bottom w:w="30" w:type="dxa"/>
+              <w:end w:w="70" w:type="dxa"/>
+            </w:tcMar>
+          </w:tcPr>
+          <w:p>
+            <w:pPr>
+              <w:spacing w:before="0" w:after="0"/>
+            </w:pPr>
+            <w:r>
+              <w:rPr>
+                <w:rFonts w:ascii="Calibri" w:hAnsi="Calibri" w:cs="Calibri" w:eastAsia="Calibri"/>
+                <w:b w:val="0"/>
+                <w:i w:val="0"/>
+                <w:color w:val="1B1B1F"/>
+                <w:sz w:val="16"/>
+              </w:rPr>
+              <w:t>P3</w:t>
             </w:r>
           </w:p>
         </w:tc>
@@ -10863,7 +11099,7 @@
         </w:tc>
         <w:tc>
           <w:tcPr>
-            <w:tcW w:type="dxa" w:w="4139"/>
+            <w:tcW w:type="dxa" w:w="3402"/>
             <w:tcMar>
               <w:top w:w="30" w:type="dxa"/>
               <w:start w:w="70" w:type="dxa"/>
@@ -10960,6 +11196,32 @@
                 <w:sz w:val="16"/>
               </w:rPr>
               <w:t xml:space="preserve"> (Schienen 5 / 9 / 4)</w:t>
+            </w:r>
+          </w:p>
+        </w:tc>
+        <w:tc>
+          <w:tcPr>
+            <w:tcW w:type="dxa" w:w="737"/>
+            <w:tcMar>
+              <w:top w:w="30" w:type="dxa"/>
+              <w:start w:w="70" w:type="dxa"/>
+              <w:bottom w:w="30" w:type="dxa"/>
+              <w:end w:w="70" w:type="dxa"/>
+            </w:tcMar>
+          </w:tcPr>
+          <w:p>
+            <w:pPr>
+              <w:spacing w:before="0" w:after="0"/>
+            </w:pPr>
+            <w:r>
+              <w:rPr>
+                <w:rFonts w:ascii="Calibri" w:hAnsi="Calibri" w:cs="Calibri" w:eastAsia="Calibri"/>
+                <w:b w:val="0"/>
+                <w:i w:val="0"/>
+                <w:color w:val="1B1B1F"/>
+                <w:sz w:val="16"/>
+              </w:rPr>
+              <w:t>P4</w:t>
             </w:r>
           </w:p>
         </w:tc>
@@ -11047,7 +11309,7 @@
         </w:tc>
         <w:tc>
           <w:tcPr>
-            <w:tcW w:type="dxa" w:w="4139"/>
+            <w:tcW w:type="dxa" w:w="3402"/>
             <w:tcMar>
               <w:top w:w="30" w:type="dxa"/>
               <w:start w:w="70" w:type="dxa"/>
@@ -11104,6 +11366,32 @@
                 <w:sz w:val="16"/>
               </w:rPr>
               <w:t>(B) (P7, P10)</w:t>
+            </w:r>
+          </w:p>
+        </w:tc>
+        <w:tc>
+          <w:tcPr>
+            <w:tcW w:type="dxa" w:w="737"/>
+            <w:tcMar>
+              <w:top w:w="30" w:type="dxa"/>
+              <w:start w:w="70" w:type="dxa"/>
+              <w:bottom w:w="30" w:type="dxa"/>
+              <w:end w:w="70" w:type="dxa"/>
+            </w:tcMar>
+          </w:tcPr>
+          <w:p>
+            <w:pPr>
+              <w:spacing w:before="0" w:after="0"/>
+            </w:pPr>
+            <w:r>
+              <w:rPr>
+                <w:rFonts w:ascii="Calibri" w:hAnsi="Calibri" w:cs="Calibri" w:eastAsia="Calibri"/>
+                <w:b w:val="0"/>
+                <w:i w:val="0"/>
+                <w:color w:val="1B1B1F"/>
+                <w:sz w:val="16"/>
+              </w:rPr>
+              <w:t>P7, P10</w:t>
             </w:r>
           </w:p>
         </w:tc>
@@ -11191,7 +11479,7 @@
         </w:tc>
         <w:tc>
           <w:tcPr>
-            <w:tcW w:type="dxa" w:w="4139"/>
+            <w:tcW w:type="dxa" w:w="3402"/>
             <w:tcMar>
               <w:top w:w="30" w:type="dxa"/>
               <w:start w:w="70" w:type="dxa"/>
@@ -11508,6 +11796,32 @@
                 <w:sz w:val="16"/>
               </w:rPr>
               <w:t>; auch X wird verschoben, P4)</w:t>
+            </w:r>
+          </w:p>
+        </w:tc>
+        <w:tc>
+          <w:tcPr>
+            <w:tcW w:type="dxa" w:w="737"/>
+            <w:tcMar>
+              <w:top w:w="30" w:type="dxa"/>
+              <w:start w:w="70" w:type="dxa"/>
+              <w:bottom w:w="30" w:type="dxa"/>
+              <w:end w:w="70" w:type="dxa"/>
+            </w:tcMar>
+          </w:tcPr>
+          <w:p>
+            <w:pPr>
+              <w:spacing w:before="0" w:after="0"/>
+            </w:pPr>
+            <w:r>
+              <w:rPr>
+                <w:rFonts w:ascii="Calibri" w:hAnsi="Calibri" w:cs="Calibri" w:eastAsia="Calibri"/>
+                <w:b w:val="0"/>
+                <w:i w:val="0"/>
+                <w:color w:val="1B1B1F"/>
+                <w:sz w:val="16"/>
+              </w:rPr>
+              <w:t>P4</w:t>
             </w:r>
           </w:p>
         </w:tc>
@@ -11595,7 +11909,7 @@
         </w:tc>
         <w:tc>
           <w:tcPr>
-            <w:tcW w:type="dxa" w:w="4139"/>
+            <w:tcW w:type="dxa" w:w="3402"/>
             <w:tcMar>
               <w:top w:w="30" w:type="dxa"/>
               <w:start w:w="70" w:type="dxa"/>
@@ -11722,6 +12036,32 @@
                 <w:sz w:val="16"/>
               </w:rPr>
               <w:t>); b) (A) (P3)</w:t>
+            </w:r>
+          </w:p>
+        </w:tc>
+        <w:tc>
+          <w:tcPr>
+            <w:tcW w:type="dxa" w:w="737"/>
+            <w:tcMar>
+              <w:top w:w="30" w:type="dxa"/>
+              <w:start w:w="70" w:type="dxa"/>
+              <w:bottom w:w="30" w:type="dxa"/>
+              <w:end w:w="70" w:type="dxa"/>
+            </w:tcMar>
+          </w:tcPr>
+          <w:p>
+            <w:pPr>
+              <w:spacing w:before="0" w:after="0"/>
+            </w:pPr>
+            <w:r>
+              <w:rPr>
+                <w:rFonts w:ascii="Calibri" w:hAnsi="Calibri" w:cs="Calibri" w:eastAsia="Calibri"/>
+                <w:b w:val="0"/>
+                <w:i w:val="0"/>
+                <w:color w:val="1B1B1F"/>
+                <w:sz w:val="16"/>
+              </w:rPr>
+              <w:t>P3</w:t>
             </w:r>
           </w:p>
         </w:tc>
@@ -11809,7 +12149,7 @@
         </w:tc>
         <w:tc>
           <w:tcPr>
-            <w:tcW w:type="dxa" w:w="4139"/>
+            <w:tcW w:type="dxa" w:w="3402"/>
             <w:tcMar>
               <w:top w:w="30" w:type="dxa"/>
               <w:start w:w="70" w:type="dxa"/>
@@ -11936,6 +12276,32 @@
                 <w:sz w:val="16"/>
               </w:rPr>
               <w:t xml:space="preserve"> (P5)</w:t>
+            </w:r>
+          </w:p>
+        </w:tc>
+        <w:tc>
+          <w:tcPr>
+            <w:tcW w:type="dxa" w:w="737"/>
+            <w:tcMar>
+              <w:top w:w="30" w:type="dxa"/>
+              <w:start w:w="70" w:type="dxa"/>
+              <w:bottom w:w="30" w:type="dxa"/>
+              <w:end w:w="70" w:type="dxa"/>
+            </w:tcMar>
+          </w:tcPr>
+          <w:p>
+            <w:pPr>
+              <w:spacing w:before="0" w:after="0"/>
+            </w:pPr>
+            <w:r>
+              <w:rPr>
+                <w:rFonts w:ascii="Calibri" w:hAnsi="Calibri" w:cs="Calibri" w:eastAsia="Calibri"/>
+                <w:b w:val="0"/>
+                <w:i w:val="0"/>
+                <w:color w:val="1B1B1F"/>
+                <w:sz w:val="16"/>
+              </w:rPr>
+              <w:t>P5</w:t>
             </w:r>
           </w:p>
         </w:tc>
@@ -12023,7 +12389,7 @@
         </w:tc>
         <w:tc>
           <w:tcPr>
-            <w:tcW w:type="dxa" w:w="4139"/>
+            <w:tcW w:type="dxa" w:w="3402"/>
             <w:tcMar>
               <w:top w:w="30" w:type="dxa"/>
               <w:start w:w="70" w:type="dxa"/>
@@ -12150,6 +12516,32 @@
                 <w:sz w:val="16"/>
               </w:rPr>
               <w:t>; b) (B) – (8 + 18) mod 26 = 0 (P7, P8)</w:t>
+            </w:r>
+          </w:p>
+        </w:tc>
+        <w:tc>
+          <w:tcPr>
+            <w:tcW w:type="dxa" w:w="737"/>
+            <w:tcMar>
+              <w:top w:w="30" w:type="dxa"/>
+              <w:start w:w="70" w:type="dxa"/>
+              <w:bottom w:w="30" w:type="dxa"/>
+              <w:end w:w="70" w:type="dxa"/>
+            </w:tcMar>
+          </w:tcPr>
+          <w:p>
+            <w:pPr>
+              <w:spacing w:before="0" w:after="0"/>
+            </w:pPr>
+            <w:r>
+              <w:rPr>
+                <w:rFonts w:ascii="Calibri" w:hAnsi="Calibri" w:cs="Calibri" w:eastAsia="Calibri"/>
+                <w:b w:val="0"/>
+                <w:i w:val="0"/>
+                <w:color w:val="1B1B1F"/>
+                <w:sz w:val="16"/>
+              </w:rPr>
+              <w:t>P7, P8</w:t>
             </w:r>
           </w:p>
         </w:tc>
@@ -12237,7 +12629,7 @@
         </w:tc>
         <w:tc>
           <w:tcPr>
-            <w:tcW w:type="dxa" w:w="4139"/>
+            <w:tcW w:type="dxa" w:w="3402"/>
             <w:tcMar>
               <w:top w:w="30" w:type="dxa"/>
               <w:start w:w="70" w:type="dxa"/>
@@ -12324,6 +12716,32 @@
                 <w:sz w:val="16"/>
               </w:rPr>
               <w:t>forum</w:t>
+            </w:r>
+          </w:p>
+        </w:tc>
+        <w:tc>
+          <w:tcPr>
+            <w:tcW w:type="dxa" w:w="737"/>
+            <w:tcMar>
+              <w:top w:w="30" w:type="dxa"/>
+              <w:start w:w="70" w:type="dxa"/>
+              <w:bottom w:w="30" w:type="dxa"/>
+              <w:end w:w="70" w:type="dxa"/>
+            </w:tcMar>
+          </w:tcPr>
+          <w:p>
+            <w:pPr>
+              <w:spacing w:before="0" w:after="0"/>
+            </w:pPr>
+            <w:r>
+              <w:rPr>
+                <w:rFonts w:ascii="Calibri" w:hAnsi="Calibri" w:cs="Calibri" w:eastAsia="Calibri"/>
+                <w:b w:val="0"/>
+                <w:i w:val="0"/>
+                <w:color w:val="1B1B1F"/>
+                <w:sz w:val="16"/>
+              </w:rPr>
+              <w:t>P4</w:t>
             </w:r>
           </w:p>
         </w:tc>
@@ -12386,7 +12804,7 @@
           <w:color w:val="1B1B1F"/>
           <w:sz w:val="19"/>
         </w:rPr>
-        <w:t xml:space="preserve"> (60 Wörter, 3–12 Buchstaben, z. B. legion, senat, forum, tribun, galeere, hoplit …) – keine Wörter aus Lab, Akten, Bossen und Videos.</w:t>
+        <w:t xml:space="preserve"> (70 Wörter, 3–12 Buchstaben, z. B. aquaedukt, atrium, ballista, fibel, toga, lorbeer …) – keine Wörter aus Lab, Akten, Bossen und Videos.</w:t>
       </w:r>
     </w:p>
     <w:tbl>

</xml_diff>

<commit_message>
Materialien neu gebaut (D15): Akten, Lösungen, Präsentationen, Lehrerhinweise, Warm-up W3
Gebaut mit bauen.py aus den geänderten Quellen, PDFs mit npm run akten,
loesungen und lehrkraft; nicht betroffene PDFs unverändert gelassen.

Co-Authored-By: Claude Opus 5.5 <noreply@anthropic.com>
Claude-Session: https://claude.ai/code/session_01JKXVQqFeKVmyQ9jfHw4db3
</commit_message>
<xml_diff>
--- a/materialien/00_Lehrerhinweise/KR_W0_Lehrerhinweise.docx
+++ b/materialien/00_Lehrerhinweise/KR_W0_Lehrerhinweise.docx
@@ -12409,7 +12409,7 @@
                 <w:color w:val="1B1B1F"/>
                 <w:sz w:val="16"/>
               </w:rPr>
-              <w:t xml:space="preserve">Ein Tribun verschlüsselt „tribun“ zuerst mit k = 8, dann mit k = 18 (Caesar). a) </w:t>
+              <w:t xml:space="preserve">Ein Tribun verschlüsselt „tribun“ zuerst mit k = 8, dann mit k = 21 (Caesar). a) </w:t>
             </w:r>
             <w:r>
               <w:rPr>
@@ -12469,7 +12469,7 @@
                 <w:color w:val="1B1B1F"/>
                 <w:sz w:val="16"/>
               </w:rPr>
-              <w:t xml:space="preserve"> Sie: Die doppelte Verschlüsselung (A) erhöht den Schlüsselraum auf 26 · 26 (B) entspricht einer Caesar-Verschiebung um 0 und ist damit wertlos (C) entspricht einer Verschiebung um 10</w:t>
+              <w:t xml:space="preserve"> Sie: Die doppelte Verschlüsselung (A) erhöht den Schlüsselraum auf 26 · 26 (B) entspricht einer einzigen Caesar-Verschiebung und bringt keine zusätzliche Sicherheit (C) ist sicherer, weil Eve zwei Schlüssel finden muss</w:t>
             </w:r>
           </w:p>
         </w:tc>
@@ -12505,7 +12505,7 @@
                 <w:color w:val="1B1B1F"/>
                 <w:sz w:val="16"/>
               </w:rPr>
-              <w:t>TRIBUN</w:t>
+              <w:t>WULEXQ</w:t>
             </w:r>
             <w:r>
               <w:rPr>
@@ -12515,7 +12515,7 @@
                 <w:color w:val="1B1B1F"/>
                 <w:sz w:val="16"/>
               </w:rPr>
-              <w:t>; b) (B) – (8 + 18) mod 26 = 0 (P7, P8)</w:t>
+              <w:t>; b) (B) – (8 + 21) mod 26 = 3 (P8)</w:t>
             </w:r>
           </w:p>
         </w:tc>
@@ -12541,7 +12541,7 @@
                 <w:color w:val="1B1B1F"/>
                 <w:sz w:val="16"/>
               </w:rPr>
-              <w:t>P7, P8</w:t>
+              <w:t>P8</w:t>
             </w:r>
           </w:p>
         </w:tc>

</xml_diff>

<commit_message>
M10: Werkzeug-Karte „Polybios & Playfair“ in Level 0.4 und 2.4, Aufgaben ohne Lösungsverrat umgebaut (L55, Task 239)
Level 0.4 (Reiter Polybios) und 2.4 (Reiter Playfair, neben dem Häufigkeits-Analysator) bekommen die Werkzeug-Karte.
Im Level-Kontext ist das Schlüsselwort fest (Regel quadrat.schluesselwort; Lehrkraft frei). Umgebaut, weil das Werkzeug
sie trotzdem vorrechnete: W0-L4-01 Zählung ab 0 (Kopf 01234, P1), W0-L4-02 rückwärts nummeriert (Kopf 54321, P4),
W2-L4-02 Füllzeichen Q (P4). Neue Fundklasse K10 im Lösungsverrat-Test; D16 in FACHLICHE_KORREKTUREN; Specs W0/W2
(und W3 K2-Reiter aus Task 235), Prüfwerte, Spec-Abgleich; Akten W0·4/W2·4 und Lehrerhinweise W0 (Kryptolabor-Abschnitt
ohne Werkstatt-Link) neu gebaut, PDFs erzeugt. Version 1.0.20.

Co-Authored-By: Claude Opus 5.5 <noreply@anthropic.com>
Claude-Session: https://claude.ai/code/session_01JKXVQqFeKVmyQ9jfHw4db3
</commit_message>
<xml_diff>
--- a/materialien/00_Lehrerhinweise/KR_W0_Lehrerhinweise.docx
+++ b/materialien/00_Lehrerhinweise/KR_W0_Lehrerhinweise.docx
@@ -7328,7 +7328,7 @@
           <w:color w:val="1B1B1F"/>
           <w:sz w:val="22"/>
         </w:rPr>
-        <w:t>Ergänzung bis zum Kryptolabor:</w:t>
+        <w:t>Kryptolabor nach der Krypto-Werkstatt:</w:t>
       </w:r>
       <w:r>
         <w:rPr>
@@ -7338,7 +7338,7 @@
           <w:color w:val="1B1B1F"/>
           <w:sz w:val="22"/>
         </w:rPr>
-        <w:t xml:space="preserve"> Die „Krypto-Werkstatt“ von André Bodendiek (enigma.andrebodendiek.de/werkstatt) bietet Caesar-Scheibe, Stab (Skytale), Tabellenbreite, Schablone und Walzen zum direkten Bedienen mit Nachspielen in Einzelschritten – gut für den Einstieg in DS 1/2, als Stationenlernen oder zur Differenzierung. Achtung: Konventionen (Nummerierung, Füllzeichen, Leserichtung) vor dem Einsatz mit Archivwissen und Akten abgleichen (Falle P1/P4).</w:t>
+        <w:t xml:space="preserve"> Chiffrierscheibe, Skytale &amp; Gitter (mit Pflügen und Fleißner-Schablone), Polybios &amp; Playfair sowie die Zusatzwerkzeuge Codes &amp; Signale und Versteckte Botschaften beruhen auf Ideen von A. Bodendiek (Krypto-Werkstatt) – Objekte zum direkten Bedienen mit Nachspielen in Einzelschritten, gut für den Einstieg in DS 1/2, als Stationenlernen oder zur Differenzierung. Die Konventionen (A = 1, Füllzeichen X, Leserichtung) sind an Archivwissen und Akten angepasst. In Level 0.4 ist das Schlüsselwort des Polybios-Werkzeugs fest, damit es die Aufgaben nicht vorrechnet (L55).</w:t>
       </w:r>
     </w:p>
     <w:p>

</xml_diff>

<commit_message>
Kryptos 1.2.0: Werkzeuge in den Aufgaben – Panels, geführter Modus, Erkenner, Doku (M11 Task 252)
Co-Authored-By: Claude Opus 5.5 <noreply@anthropic.com>
Claude-Session: https://claude.ai/code/session_01JKXVQqFeKVmyQ9jfHw4db3
</commit_message>
<xml_diff>
--- a/materialien/00_Lehrerhinweise/KR_W0_Lehrerhinweise.docx
+++ b/materialien/00_Lehrerhinweise/KR_W0_Lehrerhinweise.docx
@@ -7338,7 +7338,72 @@
           <w:color w:val="1B1B1F"/>
           <w:sz w:val="22"/>
         </w:rPr>
-        <w:t xml:space="preserve"> Chiffrierscheibe, Skytale &amp; Gitter (mit Pflügen und Fleißner-Schablone), Polybios &amp; Playfair sowie die Zusatzwerkzeuge Codes &amp; Signale und Versteckte Botschaften beruhen auf Ideen von A. Bodendiek (Krypto-Werkstatt) – Objekte zum direkten Bedienen mit Nachspielen in Einzelschritten, gut für den Einstieg in DS 1/2, als Stationenlernen oder zur Differenzierung. Die Konventionen (A = 1, Füllzeichen X, Leserichtung) sind an Archivwissen und Akten angepasst. In Level 0.4 ist das Schlüsselwort des Polybios-Werkzeugs fest, damit es die Aufgaben nicht vorrechnet (L55); Schlüsselwörter aus Aufgaben, Akten, Bossen und Warm-up baut das Werkzeug für Lernende auch im freien Labor nicht auf (Sperrliste, Lehrkräfte frei).</w:t>
+        <w:t xml:space="preserve"> Chiffrierscheibe, Skytale &amp; Gitter (mit Pflügen und Fleißner-Schablone), Polybios &amp; Playfair sowie die Zusatzwerkzeuge Codes &amp; Signale und Versteckte Botschaften beruhen auf Ideen von A. Bodendiek (Krypto-Werkstatt) – Objekte zum direkten Bedienen mit Nachspielen in Einzelschritten, gut für den Einstieg in DS 1/2, als Stationenlernen oder zur Differenzierung. Die Konventionen (A = 1, Füllzeichen X, Leserichtung) sind an Archivwissen und Akten angepasst. In Level 0.4 ist das Schlüsselwort des Polybios-Werkzeugs fest, damit es die Aufgaben nicht vorrechnet (L55); Mit Schlüsselwörtern aus Aufgaben, Akten, Bossen und Warm-up wechselt das Werkzeug für Lernende auch im freien Labor in den geführten Modus (Erkenner, seit 1.2.0; Lehrkräfte frei).</w:t>
+      </w:r>
+    </w:p>
+    <w:p>
+      <w:pPr>
+        <w:spacing w:before="0" w:after="80"/>
+      </w:pPr>
+      <w:r>
+        <w:rPr>
+          <w:rFonts w:ascii="Calibri" w:hAnsi="Calibri" w:cs="Calibri" w:eastAsia="Calibri"/>
+          <w:b/>
+          <w:i w:val="0"/>
+          <w:color w:val="1B1B1F"/>
+          <w:sz w:val="22"/>
+        </w:rPr>
+        <w:t>Werkzeuge in den Aufgaben (Version 1.2.0):</w:t>
+      </w:r>
+      <w:r>
+        <w:rPr>
+          <w:rFonts w:ascii="Calibri" w:hAnsi="Calibri" w:cs="Calibri" w:eastAsia="Calibri"/>
+          <w:b w:val="0"/>
+          <w:i w:val="0"/>
+          <w:color w:val="1B1B1F"/>
+          <w:sz w:val="22"/>
+        </w:rPr>
+        <w:t xml:space="preserve"> In 19 Aufgaben dieser Welt klappt das passende Werkzeug direkt in der Aufgabe auf (Panel; ab 1100 px Bildschirmbreite als Seitenleiste neben dem Antwortfeld, sonst unter der Aufgabe; „Im Labor öffnen“ als Zweitlink; im Boss nie). Archivfund: Skytale &amp; Gitter geführt (A-01) · 0.1: Codes &amp; Signale frei (L1-02), Skytale &amp; Gitter geführt (L1-03, L1-04, L1-05, L1-06, L1-07), Skytale &amp; Gitter frei (L1-08) · 0.2: Chiffrierscheibe geführt (L2-01, L2-02, L2-03, L2-04, L2-05, L2-08) · 0.3: Chiffrierscheibe geführt (L3-05) · 0.4: Polybios &amp; Playfair frei (L4-01, L4-02, L4-05, L4-07). </w:t>
+      </w:r>
+      <w:r>
+        <w:rPr>
+          <w:rFonts w:ascii="Calibri" w:hAnsi="Calibri" w:cs="Calibri" w:eastAsia="Calibri"/>
+          <w:b/>
+          <w:i w:val="0"/>
+          <w:color w:val="1B1B1F"/>
+          <w:sz w:val="22"/>
+        </w:rPr>
+        <w:t>Geführt</w:t>
+      </w:r>
+      <w:r>
+        <w:rPr>
+          <w:rFonts w:ascii="Calibri" w:hAnsi="Calibri" w:cs="Calibri" w:eastAsia="Calibri"/>
+          <w:b w:val="0"/>
+          <w:i w:val="0"/>
+          <w:color w:val="1B1B1F"/>
+          <w:sz w:val="22"/>
+        </w:rPr>
+        <w:t xml:space="preserve"> heißt: Das Werkzeug zeigt die Werte der Aufgabe und markiert nur den aktuellen Schritt; die Lernenden lesen bzw. rechnen jeden Schritt selbst und tragen ihn ein. Rückmeldung (✓/✗ je Schritt) gibt es erst, wenn die Aufgabe gelöst oder die Lösung angesehen ist – vorher bewertet das Werkzeug nichts. </w:t>
+      </w:r>
+      <w:r>
+        <w:rPr>
+          <w:rFonts w:ascii="Calibri" w:hAnsi="Calibri" w:cs="Calibri" w:eastAsia="Calibri"/>
+          <w:b/>
+          <w:i w:val="0"/>
+          <w:color w:val="1B1B1F"/>
+          <w:sz w:val="22"/>
+        </w:rPr>
+        <w:t>Frei</w:t>
+      </w:r>
+      <w:r>
+        <w:rPr>
+          <w:rFonts w:ascii="Calibri" w:hAnsi="Calibri" w:cs="Calibri" w:eastAsia="Calibri"/>
+          <w:b w:val="0"/>
+          <w:i w:val="0"/>
+          <w:color w:val="1B1B1F"/>
+          <w:sz w:val="22"/>
+        </w:rPr>
+        <w:t xml:space="preserve"> heißt: Ausprobieren mit eigenen Werten. Auch im freien Labor und auf den Level-Karten („Hier ausprobieren“) wechselt ein Werkzeug bei Werten aus Aufgaben, Akten, Bossen oder Warm-up in den geführten Modus. In der Lehrkraft-Vorschau sind die richtigen Schritte sofort sichtbar. Ausnahme W0-L2-04 (Entscheidung L60): Die Liste aller Verschiebungen mit dem Geheimtext der Aufgabe bleibt erlaubt – das Erkennen des Klartexts ist dort die Lernleistung.</w:t>
       </w:r>
     </w:p>
     <w:p>

</xml_diff>

<commit_message>
Kryptos 1.3.0: Objekte in den Aufgaben – Stab, Zaun, Karton, Ring geführt am Objekt (M12)
Doku (TECHNIK, DESIGNSYSTEM, README, Gesamtplan, Lehrerhinweise W0/W3), Fotos kr-05, kr-28, kr-37–39.

Co-Authored-By: Claude Opus 5.5 <noreply@anthropic.com>
Claude-Session: https://claude.ai/code/session_01JKXVQqFeKVmyQ9jfHw4db3
</commit_message>
<xml_diff>
--- a/materialien/00_Lehrerhinweise/KR_W0_Lehrerhinweise.docx
+++ b/materialien/00_Lehrerhinweise/KR_W0_Lehrerhinweise.docx
@@ -7403,7 +7403,27 @@
           <w:color w:val="1B1B1F"/>
           <w:sz w:val="22"/>
         </w:rPr>
-        <w:t xml:space="preserve"> heißt: Ausprobieren mit eigenen Werten. Auch im freien Labor und auf den Level-Karten („Hier ausprobieren“) wechselt ein Werkzeug bei Werten aus Aufgaben, Akten, Bossen oder Warm-up in den geführten Modus. In der Lehrkraft-Vorschau sind die richtigen Schritte sofort sichtbar. Ausnahme W0-L2-04 (Entscheidung L60): Die Liste aller Verschiebungen mit dem Geheimtext der Aufgabe bleibt erlaubt – das Erkennen des Klartexts ist dort die Lernleistung.</w:t>
+        <w:t xml:space="preserve"> heißt: Ausprobieren mit eigenen Werten. Auch im freien Labor und auf den Level-Karten („Hier ausprobieren“) wechselt ein Werkzeug bei Werten aus Aufgaben, Akten, Bossen oder Warm-up in den geführten Modus. In der Lehrkraft-Vorschau sind die richtigen Schritte sofort sichtbar. Ausnahme W0-L2-04 (Entscheidung L60): Die Liste aller Verschiebungen mit dem Geheimtext der Aufgabe bleibt erlaubt – das Erkennen des Klartexts ist dort die Lernleistung. </w:t>
+      </w:r>
+      <w:r>
+        <w:rPr>
+          <w:rFonts w:ascii="Calibri" w:hAnsi="Calibri" w:cs="Calibri" w:eastAsia="Calibri"/>
+          <w:b/>
+          <w:i w:val="0"/>
+          <w:color w:val="1B1B1F"/>
+          <w:sz w:val="22"/>
+        </w:rPr>
+        <w:t>Seit Version 1.3.0</w:t>
+      </w:r>
+      <w:r>
+        <w:rPr>
+          <w:rFonts w:ascii="Calibri" w:hAnsi="Calibri" w:cs="Calibri" w:eastAsia="Calibri"/>
+          <w:b w:val="0"/>
+          <w:i w:val="0"/>
+          <w:color w:val="1B1B1F"/>
+          <w:sz w:val="22"/>
+        </w:rPr>
+        <w:t xml:space="preserve"> sind diese Panels beim Öffnen der Aufgabe schon aufgeklappt (Schalter „Skytale-Stab benutzen“, „Gartenzaun benutzen“, „Fleißner-Karton benutzen“, „Chiffrierscheibe benutzen“ …), und geführt wird am Objekt selbst: Die Lernenden stempeln den Klartext auf den Holzstab und lesen beim Abwickeln Runde für Runde ab bzw. lesen den aufgewickelten Geheimtext Zeile für Zeile entlang des Stabs; am Zaun schreiben sie im Zickzack und lesen Schiene für Schiene; am Fleißner-Karton füllen sie die leuchtenden Löcher, der Karton dreht sich je Lage. Die Tabelle der Aufgabe bleibt das Antwortfeld.</w:t>
       </w:r>
     </w:p>
     <w:p>

</xml_diff>

<commit_message>
Kryptos 1.3.1: ADFGVX-Quadrat, Spalten-Raster, Alphabet-Leiste in den Aufgaben; Klartext nie in Fünfergruppen; Lehrerhinweise W0, W1, W3
Co-Authored-By: Claude Opus 5.5 <noreply@anthropic.com>
Claude-Session: https://claude.ai/code/session_01JKXVQqFeKVmyQ9jfHw4db3
</commit_message>
<xml_diff>
--- a/materialien/00_Lehrerhinweise/KR_W0_Lehrerhinweise.docx
+++ b/materialien/00_Lehrerhinweise/KR_W0_Lehrerhinweise.docx
@@ -7353,7 +7353,7 @@
           <w:color w:val="1B1B1F"/>
           <w:sz w:val="22"/>
         </w:rPr>
-        <w:t>Werkzeuge in den Aufgaben (Version 1.2.0):</w:t>
+        <w:t>Werkzeuge in den Aufgaben (Version 1.2.0, ergänzt 1.3.1):</w:t>
       </w:r>
       <w:r>
         <w:rPr>
@@ -7363,7 +7363,7 @@
           <w:color w:val="1B1B1F"/>
           <w:sz w:val="22"/>
         </w:rPr>
-        <w:t xml:space="preserve"> In 19 Aufgaben dieser Welt klappt das passende Werkzeug direkt in der Aufgabe auf (Panel; ab 1100 px Bildschirmbreite als Seitenleiste neben dem Antwortfeld, sonst unter der Aufgabe; „Im Labor öffnen“ als Zweitlink; im Boss nie). Archivfund: Skytale &amp; Gitter geführt (A-01) · 0.1: Codes &amp; Signale frei (L1-02), Skytale &amp; Gitter geführt (L1-03, L1-04, L1-05, L1-06, L1-07), Skytale &amp; Gitter frei (L1-08) · 0.2: Chiffrierscheibe geführt (L2-01, L2-02, L2-03, L2-04, L2-05, L2-08) · 0.3: Chiffrierscheibe geführt (L3-05) · 0.4: Polybios &amp; Playfair frei (L4-01, L4-02, L4-05, L4-07). </w:t>
+        <w:t xml:space="preserve"> In 20 Aufgaben dieser Welt klappt das passende Werkzeug direkt in der Aufgabe auf (Panel; ab 1100 px Bildschirmbreite als Seitenleiste neben dem Antwortfeld, sonst unter der Aufgabe; „Im Labor öffnen“ als Zweitlink; im Boss nie). Archivfund: Skytale &amp; Gitter geführt (A-01) · 0.1: Codes &amp; Signale frei (L1-02), Skytale &amp; Gitter geführt (L1-03, L1-04, L1-05, L1-06, L1-07), Skytale &amp; Gitter frei (L1-08) · 0.2: Chiffrierscheibe geführt (L2-01, L2-02, L2-03, L2-04, L2-05, L2-08) · 0.3: Chiffrierscheibe geführt (L3-05) · 0.4: Polybios &amp; Playfair frei (L4-01, L4-02, L4-05, L4-07), Chiffrierscheibe · Alphabet-Leiste geführt (L4-03, Atbash als gespiegelte Leiste). </w:t>
       </w:r>
       <w:r>
         <w:rPr>

</xml_diff>